<commit_message>
Update point-by-point response figure/table numbers to match final v4 numbering; add Byzantine to disfavoured list
Co-Authored-By: Tatsuki Onishi <bougtoir@gmail.com>
</commit_message>
<xml_diff>
--- a/manuscript/hassc_p2p_response_r1.docx
+++ b/manuscript/hassc_p2p_response_r1.docx
@@ -116,13 +116,7 @@
           <w:b/>
           <w:sz w:val="22"/>
         </w:rPr>
-        <w:t xml:space="preserve">Response: </w:t>
-      </w:r>
-      <w:r>
-        <w:rPr>
-          <w:sz w:val="22"/>
-        </w:rPr>
-        <w:t>We have performed a full Weibull analysis of the pre-1000 CE papacy data (N = 140). The results support the reviewer's hypothesis: the pre-1000 CE papacy yields k = 1.092 (95% CI [0.98, 1.25]), which is indeed close to k = 1 (exponential/memoryless), compared with k = 1.163 (95% CI [1.04, 1.33]) for the post-1000 CE period. The two-sample Kolmogorov-Smirnov test (p = 0.5629) and Mann-Whitney U test (p = 0.1347) indicate no statistically significant difference between the two periods, although the shift from near-exponential to mildly increasing hazard is consistent with the institutional stabilisation brought by the conclave system. These results have been added to the revised manuscript as a new subsection in the Results ("Papacy: pre-1000 CE vs post-1000 CE comparison") with an accompanying figure (new Figure 9). The implications are discussed in the revised Discussion.</w:t>
+        <w:t>Response: We have performed a full Weibull analysis of the pre-1000 CE papacy data (N = 140). The results support the reviewer's hypothesis: the pre-1000 CE papacy yields k = 1.092 (95% CI [0.98, 1.25]), which is indeed close to k = 1 (exponential/memoryless), compared with k = 1.163 (95% CI [1.04, 1.33]) for the post-1000 CE period. The two-sample Kolmogorov-Smirnov test (p = 0.5629) and Mann-Whitney U test (p = 0.1347) indicate no statistically significant difference between the two periods, although the shift from near-exponential to mildly increasing hazard is consistent with the institutional stabilisation brought by the conclave system. These results have been added to the revised manuscript as a new subsection in the Results ("Papacy: pre-1000 CE vs post-1000 CE comparison") with an accompanying figure (new Figure 6). The implications are discussed in the revised Discussion.</w:t>
       </w:r>
     </w:p>
     <w:p/>
@@ -151,13 +145,7 @@
           <w:b/>
           <w:sz w:val="22"/>
         </w:rPr>
-        <w:t xml:space="preserve">Response: </w:t>
-      </w:r>
-      <w:r>
-        <w:rPr>
-          <w:sz w:val="22"/>
-        </w:rPr>
-        <w:t>We have added a detailed comparison with Saleh's (2019) mixture Weibull model in the revised Discussion. The key difference lies in the outcome variable: Saleh analysed time-to-violent-death specifically for Roman emperors, whereas we analyse total reign duration regardless of cause of termination. Our single Weibull fit (k = 0.880) captures the overall coup-prone character of the Roman Empire, while Saleh's mixture model (with two components reflecting early assassination risk and later-tenure wear-out) captures the bimodal hazard structure (bathtub curve). We fitted our own mixture Weibull to the Roman data: AIC favours the mixture (327.7 vs 332.8), while BIC favours the single model (337.8 vs 336.8), reflecting the complexity penalty. We argue that for cross-polity comparison (our primary objective), the single shape parameter k provides a parsimonious and interpretable summary, while acknowledging that mixture models can reveal finer within-polity dynamics. This discussion is now included with a new figure (Figure 10).</w:t>
+        <w:t>Response: We have added a detailed comparison with Saleh's (2019) mixture Weibull model in the revised Discussion. The key difference lies in the outcome variable: Saleh analysed time-to-violent-death specifically for Roman emperors, whereas we analyse total reign duration regardless of cause of termination. Our single Weibull fit (k = 0.880) captures the overall coup-prone character of the Roman Empire, while Saleh's mixture model (with two components reflecting early assassination risk and later-tenure wear-out) captures the bimodal hazard structure (bathtub curve). We fitted our own mixture Weibull to the Roman data: AIC favours the mixture (327.7 vs 332.8), while BIC favours the single model (337.8 vs 336.8), reflecting the complexity penalty. We argue that for cross-polity comparison (our primary objective), the single shape parameter k provides a parsimonious and interpretable summary, while acknowledging that mixture models can reveal finer within-polity dynamics. This discussion is now included with a new figure (Figure 12).</w:t>
       </w:r>
     </w:p>
     <w:p/>
@@ -207,16 +195,10 @@
           <w:b/>
           <w:sz w:val="22"/>
         </w:rPr>
-        <w:t xml:space="preserve">Response: </w:t>
-      </w:r>
-      <w:r>
-        <w:rPr>
-          <w:sz w:val="22"/>
-        </w:rPr>
-        <w:t xml:space="preserve">We have conducted a systematic model selection exercise comparing Weibull, log-normal, gamma, and exponential distributions for all 31 polities using both AIC and BIC. Results are presented in a new Table 6 and Figure 11 in the revised manuscript. </w:t>
+        <w:t xml:space="preserve">Response: We have conducted a systematic model selection exercise comparing Weibull, log-normal, gamma, and exponential distributions for all 31 polities using both AIC and BIC. Results are presented in a new Figure 2 in the revised manuscript. </w:t>
         <w:br/>
         <w:br/>
-        <w:t xml:space="preserve">The Weibull distribution is the AIC-preferred model for 12 of 31 polities. Critically, Weibull falls within ΔAIC &lt; 2 of the best model for 26 of 31 polities, indicating that it is a statistically competitive fit for the vast majority of the dataset. The polities where Weibull is clearly disfavoured (ΔAIC &gt; 4) are Japan (Emperors), where the log-normal provides a substantially better fit due to the heavy right tail, and the USA (Presidents), where the log-normal captures the discrete term-limited structure more naturally. </w:t>
+        <w:t xml:space="preserve">The Weibull distribution is the AIC-preferred model for 12 of 31 polities. Critically, Weibull falls within ΔAIC &lt; 2 of the best model for 26 of 31 polities, indicating that it is a statistically competitive fit for the vast majority of the dataset. The polities where Weibull is clearly disfavoured (ΔAIC &gt; 4) are Japan (Emperors, ΔAIC = 17.4), where the log-normal provides a substantially better fit due to the heavy right tail; the USA (Presidents, ΔAIC = 9.6), where the log-normal captures the discrete term-limited structure more naturally; and the Byzantine Empire (ΔAIC = 4.6), also better described by the log-normal. </w:t>
         <w:br/>
         <w:br/>
         <w:t>We now explicitly acknowledge that the Weibull is not universally the best-fitting distribution but argue that its interpretive advantages (the shape parameter k maps directly onto hazard dynamics via the bathtub curve framework) and its competitive fit across the majority of polities justify its use as the primary analytical framework for cross-polity comparison. This discussion has been added to the Methods ("Model selection") and Discussion sections.</w:t>
@@ -289,16 +271,10 @@
           <w:b/>
           <w:sz w:val="22"/>
         </w:rPr>
-        <w:t xml:space="preserve">Response: </w:t>
-      </w:r>
-      <w:r>
-        <w:rPr>
-          <w:sz w:val="22"/>
-        </w:rPr>
-        <w:t xml:space="preserve">We have established an explicit minimum sample size threshold of N = 15, below which polity-level k estimates are reported in Table 1 but are not interpreted qualitatively in terms of stability regime. This affects four polities: Aztec Empire (N = 9), Thailand Chakri (N = 10), China Qing (N = 11), and Inca Empire (N = 12). These are now flagged in Table 1 with a dagger symbol and a footnote. </w:t>
+        <w:t xml:space="preserve">Response: We have established an explicit minimum sample size threshold of N = 15, below which polity-level k estimates are reported in Table 1 but are not interpreted qualitatively in terms of stability regime. This affects four polities: Aztec Empire (N = 9), Thailand Chakri (N = 10), China Qing (N = 11), and Inca Empire (N = 12). These are now flagged in Table 1 with a dagger symbol and a footnote. </w:t>
         <w:br/>
         <w:br/>
-        <w:t>Additionally, we now report which polities have 95% CIs that cross k = 1 (14 of 31 polities), and explicitly note in the Results and Discussion that qualitative regime classification for these polities should be treated with caution. The Mughal Empire, specifically cited by the reviewer, is now described as having "indeterminate" stability regime rather than being placed in the coup-prone cluster. A new figure (Figure 12) illustrating CI widths as a function of sample size has been added.</w:t>
+        <w:t>Additionally, we now report which polities have 95% CIs that cross k = 1 (14 of 31 polities), and explicitly note in the Results and Discussion that qualitative regime classification for these polities should be treated with caution. The Mughal Empire, specifically cited by the reviewer, is now described as having "indeterminate" stability regime rather than being placed in the coup-prone cluster. A new figure (Figure 11) illustrating CI widths as a function of sample size has been added.</w:t>
       </w:r>
     </w:p>
     <w:p/>

</xml_diff>